<commit_message>
fix open-source application: commit count 20, contributor 1
</commit_message>
<xml_diff>
--- a/docs/开源成果申报书_AI会议语音转写与检索_最终版.docx
+++ b/docs/开源成果申报书_AI会议语音转写与检索_最终版.docx
@@ -657,7 +657,7 @@
                 <w:rFonts w:ascii="微软雅黑" w:hAnsi="微软雅黑" w:eastAsia="微软雅黑"/>
                 <w:sz w:val="21"/>
               </w:rPr>
-              <w:t>0（提交作者为匿名 "Student"）</w:t>
+              <w:t>1（本地 Git author 确认，唯一学生贡献者）</w:t>
             </w:r>
           </w:p>
         </w:tc>
@@ -737,7 +737,7 @@
                 <w:rFonts w:ascii="微软雅黑" w:hAnsi="微软雅黑" w:eastAsia="微软雅黑"/>
                 <w:sz w:val="21"/>
               </w:rPr>
-              <w:t>19</w:t>
+              <w:t>20</w:t>
             </w:r>
           </w:p>
         </w:tc>

</xml_diff>